<commit_message>
Update digital twin architecture and documentation
Co-authored-by: Copilot <223556219+Copilot@users.noreply.github.com>
</commit_message>
<xml_diff>
--- a/fabric_digital_twin/docs/Dokumentasi-Demo-Digital-Twin-Fabric.docx
+++ b/fabric_digital_twin/docs/Dokumentasi-Demo-Digital-Twin-Fabric.docx
@@ -3642,7 +3642,7 @@
       <w:r>
         <w:drawing>
           <wp:inline distT="0" distB="0" distL="0" distR="0">
-            <wp:extent cx="5715000" cy="3086100"/>
+            <wp:extent cx="5715000" cy="2930395"/>
             <wp:effectExtent t="0" r="0" b="0" l="0"/>
             <wp:docPr id="1" name="" descr="" title=""/>
             <wp:cNvGraphicFramePr>
@@ -3667,7 +3667,7 @@
                   <pic:spPr bwMode="auto">
                     <a:xfrm>
                       <a:off x="0" y="0"/>
-                      <a:ext cx="5715000" cy="3086100"/>
+                      <a:ext cx="5715000" cy="2930395"/>
                     </a:xfrm>
                     <a:prstGeom prst="rect">
                       <a:avLst/>

</xml_diff>